<commit_message>
Mark briefing docs as Lockheed Martin Proprietary
Byline is Thomas Rathbun, PhD. Proprietary line is in every header
and footer of the progress report, block guide, and slide decks.
</commit_message>
<xml_diff>
--- a/artifacts/Architecture_Block_Guide.docx
+++ b/artifacts/Architecture_Block_Guide.docx
@@ -13355,25 +13355,25 @@
   <w:p>
     <w:pPr>
       <w:pBdr>
-        <w:top w:val="single" w:color="B0BEC5" w:sz="6" w:space="6"/>
+        <w:top w:val="single" w:color="B0BEC5" w:sz="6" w:space="4"/>
       </w:pBdr>
       <w:tabs>
         <w:tab w:val="right" w:pos="10440"/>
       </w:tabs>
-      <w:spacing w:before="60"/>
+      <w:spacing w:after="20" w:before="40"/>
     </w:pPr>
     <w:r>
       <w:rPr>
         <w:rFonts w:ascii="Arial" w:cs="Arial" w:eastAsia="Arial" w:hAnsi="Arial"/>
-        <w:b w:val="false"/>
-        <w:bCs w:val="false"/>
+        <w:b/>
+        <w:bCs/>
         <w:i w:val="false"/>
         <w:iCs w:val="false"/>
-        <w:color w:val="5A6A75"/>
-        <w:sz w:val="15"/>
-        <w:szCs w:val="15"/>
+        <w:color w:val="7A1F1F"/>
+        <w:sz w:val="13"/>
+        <w:szCs w:val="13"/>
       </w:rPr>
-      <w:t xml:space="preserve">Tom Rathbun  ·  16 August 2026  ·  Point at the box, then read its heading</w:t>
+      <w:t xml:space="preserve">LOCKHEED MARTIN PROPRIETARY INFORMATION</w:t>
     </w:r>
     <w:r>
       <w:rPr>
@@ -13396,8 +13396,8 @@
         <w:i w:val="false"/>
         <w:iCs w:val="false"/>
         <w:color w:val="5A6A75"/>
-        <w:sz w:val="15"/>
-        <w:szCs w:val="15"/>
+        <w:sz w:val="13"/>
+        <w:szCs w:val="13"/>
       </w:rPr>
       <w:t xml:space="preserve">Page </w:t>
     </w:r>
@@ -13405,13 +13405,28 @@
       <w:rPr>
         <w:rFonts w:ascii="Arial" w:cs="Arial" w:eastAsia="Arial" w:hAnsi="Arial"/>
         <w:color w:val="5A6A75"/>
-        <w:sz w:val="15"/>
-        <w:szCs w:val="15"/>
+        <w:sz w:val="13"/>
+        <w:szCs w:val="13"/>
       </w:rPr>
       <w:fldChar w:fldCharType="begin"/>
       <w:instrText xml:space="preserve">PAGE</w:instrText>
       <w:fldChar w:fldCharType="separate"/>
       <w:fldChar w:fldCharType="end"/>
+    </w:r>
+  </w:p>
+  <w:p>
+    <w:r>
+      <w:rPr>
+        <w:rFonts w:ascii="Arial" w:cs="Arial" w:eastAsia="Arial" w:hAnsi="Arial"/>
+        <w:b w:val="false"/>
+        <w:bCs w:val="false"/>
+        <w:i w:val="false"/>
+        <w:iCs w:val="false"/>
+        <w:color w:val="5A6A75"/>
+        <w:sz w:val="13"/>
+        <w:szCs w:val="13"/>
+      </w:rPr>
+      <w:t xml:space="preserve">Thomas Rathbun, PhD  ·  16 August 2026  ·  Point at the box, then read its heading</w:t>
     </w:r>
   </w:p>
 </w:ftr>
@@ -13464,7 +13479,7 @@
       <w:tabs>
         <w:tab w:val="right" w:pos="10440"/>
       </w:tabs>
-      <w:spacing w:after="80"/>
+      <w:spacing w:after="40"/>
     </w:pPr>
     <w:r>
       <w:rPr>
@@ -13474,8 +13489,8 @@
         <w:i w:val="false"/>
         <w:iCs w:val="false"/>
         <w:color w:val="0B3D5C"/>
-        <w:sz w:val="16"/>
-        <w:szCs w:val="16"/>
+        <w:sz w:val="15"/>
+        <w:szCs w:val="15"/>
       </w:rPr>
       <w:t xml:space="preserve">AI Tracker Correlator</w:t>
     </w:r>
@@ -13487,10 +13502,44 @@
         <w:i w:val="false"/>
         <w:iCs w:val="false"/>
         <w:color w:val="5A6A75"/>
-        <w:sz w:val="16"/>
-        <w:szCs w:val="16"/>
+        <w:sz w:val="15"/>
+        <w:szCs w:val="15"/>
       </w:rPr>
-      <w:t xml:space="preserve">	Architecture block guide  ·  briefing script</w:t>
+      <w:t xml:space="preserve">  ·  Architecture block guide  ·  briefing script</w:t>
+    </w:r>
+  </w:p>
+  <w:p>
+    <w:pPr>
+      <w:tabs>
+        <w:tab w:val="right" w:pos="10440"/>
+      </w:tabs>
+      <w:spacing w:after="60"/>
+    </w:pPr>
+    <w:r>
+      <w:rPr>
+        <w:rFonts w:ascii="Arial" w:cs="Arial" w:eastAsia="Arial" w:hAnsi="Arial"/>
+        <w:b/>
+        <w:bCs/>
+        <w:i w:val="false"/>
+        <w:iCs w:val="false"/>
+        <w:color w:val="7A1F1F"/>
+        <w:sz w:val="14"/>
+        <w:szCs w:val="14"/>
+      </w:rPr>
+      <w:t xml:space="preserve">LOCKHEED MARTIN PROPRIETARY INFORMATION</w:t>
+    </w:r>
+    <w:r>
+      <w:rPr>
+        <w:rFonts w:ascii="Arial" w:cs="Arial" w:eastAsia="Arial" w:hAnsi="Arial"/>
+        <w:b w:val="false"/>
+        <w:bCs w:val="false"/>
+        <w:i w:val="false"/>
+        <w:iCs w:val="false"/>
+        <w:color w:val="5A6A75"/>
+        <w:sz w:val="14"/>
+        <w:szCs w:val="14"/>
+      </w:rPr>
+      <w:t xml:space="preserve">	Thomas Rathbun, PhD</w:t>
     </w:r>
   </w:p>
 </w:hdr>

</xml_diff>